<commit_message>
Power Bi update (#102)
</commit_message>
<xml_diff>
--- a/Lõputöö kirjeldus.docx
+++ b/Lõputöö kirjeldus.docx
@@ -139,7 +139,7 @@
           <w:noProof/>
         </w:rPr>
         <w:pict w14:anchorId="0E3B09B4">
-          <v:rect id="_x0000_i1025" style="width:0;height:1.5pt" o:hralign="center" o:hrstd="t" o:hr="t" fillcolor="#a0a0a0" stroked="f"/>
+          <v:rect id="_x0000_i1026" style="width:0;height:1.5pt" o:hralign="center" o:hrstd="t" o:hr="t" fillcolor="#a0a0a0" stroked="f"/>
         </w:pict>
       </w:r>
     </w:p>
@@ -465,7 +465,7 @@
           <w:noProof/>
         </w:rPr>
         <w:pict w14:anchorId="09EFF518">
-          <v:rect id="_x0000_i1026" style="width:0;height:1.5pt" o:hralign="center" o:hrstd="t" o:hr="t" fillcolor="#a0a0a0" stroked="f"/>
+          <v:rect id="_x0000_i1027" style="width:0;height:1.5pt" o:hralign="center" o:hrstd="t" o:hr="t" fillcolor="#a0a0a0" stroked="f"/>
         </w:pict>
       </w:r>
     </w:p>
@@ -741,7 +741,7 @@
           <w:noProof/>
         </w:rPr>
         <w:pict w14:anchorId="559A3DC2">
-          <v:rect id="_x0000_i1027" style="width:0;height:1.5pt" o:hralign="center" o:hrstd="t" o:hr="t" fillcolor="#a0a0a0" stroked="f"/>
+          <v:rect id="_x0000_i1028" style="width:0;height:1.5pt" o:hralign="center" o:hrstd="t" o:hr="t" fillcolor="#a0a0a0" stroked="f"/>
         </w:pict>
       </w:r>
     </w:p>
@@ -1084,7 +1084,7 @@
           <w:noProof/>
         </w:rPr>
         <w:pict w14:anchorId="1940237B">
-          <v:rect id="_x0000_i1028" style="width:0;height:1.5pt" o:hralign="center" o:hrstd="t" o:hr="t" fillcolor="#a0a0a0" stroked="f"/>
+          <v:rect id="_x0000_i1029" style="width:0;height:1.5pt" o:hralign="center" o:hrstd="t" o:hr="t" fillcolor="#a0a0a0" stroked="f"/>
         </w:pict>
       </w:r>
     </w:p>
@@ -1184,6 +1184,14 @@
           <w:noProof/>
         </w:rPr>
       </w:pPr>
+    </w:p>
+    <w:p>
+      <w:pPr>
+        <w:pStyle w:val="Heading1"/>
+        <w:rPr>
+          <w:noProof/>
+        </w:rPr>
+      </w:pPr>
       <w:r>
         <w:rPr>
           <w:noProof/>
@@ -1192,10 +1200,6 @@
       </w:r>
     </w:p>
     <w:p/>
-    <w:p/>
-    <w:p/>
-    <w:p/>
-    <w:p/>
     <w:p>
       <w:pPr>
         <w:rPr>
@@ -1203,26 +1207,44 @@
           <w:bCs/>
         </w:rPr>
       </w:pPr>
+      <w:proofErr w:type="spellStart"/>
       <w:r>
         <w:rPr>
           <w:b/>
           <w:bCs/>
         </w:rPr>
-        <w:t xml:space="preserve">Dim-mudel </w:t>
-      </w:r>
+        <w:t>Dim</w:t>
+      </w:r>
+      <w:proofErr w:type="spellEnd"/>
       <w:r>
         <w:rPr>
           <w:b/>
           <w:bCs/>
         </w:rPr>
-        <w:t>Postgres</w:t>
-      </w:r>
+        <w:t xml:space="preserve">-mudel </w:t>
+      </w:r>
+      <w:proofErr w:type="spellStart"/>
       <w:r>
         <w:rPr>
           <w:b/>
           <w:bCs/>
         </w:rPr>
-        <w:t xml:space="preserve">SQL </w:t>
+        <w:t>Postgres</w:t>
+      </w:r>
+      <w:r>
+        <w:rPr>
+          <w:b/>
+          <w:bCs/>
+        </w:rPr>
+        <w:t>SQL</w:t>
+      </w:r>
+      <w:proofErr w:type="spellEnd"/>
+      <w:r>
+        <w:rPr>
+          <w:b/>
+          <w:bCs/>
+        </w:rPr>
+        <w:t xml:space="preserve"> </w:t>
       </w:r>
       <w:commentRangeStart w:id="3"/>
       <w:commentRangeStart w:id="4"/>
@@ -1295,13 +1317,26 @@
         <w:t>F</w:t>
       </w:r>
       <w:r>
-        <w:t>aktitabeli fact_</w:t>
+        <w:t xml:space="preserve">aktitabeli </w:t>
+      </w:r>
+      <w:proofErr w:type="spellStart"/>
+      <w:r>
+        <w:t>fact_</w:t>
       </w:r>
       <w:r>
         <w:t>kv</w:t>
       </w:r>
-      <w:r>
-        <w:t xml:space="preserve"> grain on</w:t>
+      <w:proofErr w:type="spellEnd"/>
+      <w:r>
+        <w:t xml:space="preserve"> </w:t>
+      </w:r>
+      <w:proofErr w:type="spellStart"/>
+      <w:r>
+        <w:t>grain</w:t>
+      </w:r>
+      <w:proofErr w:type="spellEnd"/>
+      <w:r>
+        <w:t xml:space="preserve"> on</w:t>
       </w:r>
       <w:r>
         <w:t xml:space="preserve"> ühe maakonna korterite keskmine m2 hind ühes kvartalis.</w:t>
@@ -1312,38 +1347,74 @@
     </w:p>
     <w:p>
       <w:r>
-        <w:t>Faktitabeli fact_palk grain on ühe maakonna keskmine brutopalk ühes kvartalis.</w:t>
-      </w:r>
-      <w:r>
-        <w:t xml:space="preserve"> 3 veergu, 1290 rida. </w:t>
-      </w:r>
-      <w:r>
-        <w:t>Ajaperiood 2005-2026, 15 maakonda.</w:t>
+        <w:t xml:space="preserve">Faktitabeli </w:t>
+      </w:r>
+      <w:proofErr w:type="spellStart"/>
+      <w:r>
+        <w:t>fact_palk</w:t>
+      </w:r>
+      <w:proofErr w:type="spellEnd"/>
+      <w:r>
+        <w:t xml:space="preserve"> </w:t>
+      </w:r>
+      <w:proofErr w:type="spellStart"/>
+      <w:r>
+        <w:t>grain</w:t>
+      </w:r>
+      <w:proofErr w:type="spellEnd"/>
+      <w:r>
+        <w:t xml:space="preserve"> on ühe maakonna keskmine brutopalk ühes kvartalis.</w:t>
+      </w:r>
+      <w:r>
+        <w:t xml:space="preserve"> 3 veergu, 1290 rida. Ajaperiood 2005-2026, 15 maakonda.</w:t>
       </w:r>
     </w:p>
     <w:p>
       <w:r>
-        <w:t>Faktitabeli fact_intressid grain on Eesti keskmine laenuintressi määr ühes kvartalis.</w:t>
-      </w:r>
-      <w:r>
-        <w:t xml:space="preserve"> 2 veergu, 86 rida. </w:t>
-      </w:r>
-      <w:r>
-        <w:t>Ajaperiood 2005-2026</w:t>
-      </w:r>
-      <w:r>
-        <w:t>.</w:t>
+        <w:t xml:space="preserve">Faktitabeli </w:t>
+      </w:r>
+      <w:proofErr w:type="spellStart"/>
+      <w:r>
+        <w:t>fact_intressid</w:t>
+      </w:r>
+      <w:proofErr w:type="spellEnd"/>
+      <w:r>
+        <w:t xml:space="preserve"> </w:t>
+      </w:r>
+      <w:proofErr w:type="spellStart"/>
+      <w:r>
+        <w:t>grain</w:t>
+      </w:r>
+      <w:proofErr w:type="spellEnd"/>
+      <w:r>
+        <w:t xml:space="preserve"> on Eesti keskmine laenuintressi määr ühes kvartalis.</w:t>
+      </w:r>
+      <w:r>
+        <w:t xml:space="preserve"> 2 veergu, 86 rida. Ajaperiood 2005-2026.</w:t>
       </w:r>
     </w:p>
     <w:p>
       <w:r>
-        <w:t>Faktitabeli fact_thi grain on Eesti keskmine THI indeks ühes kvartalis.</w:t>
-      </w:r>
+        <w:t xml:space="preserve">Faktitabeli </w:t>
+      </w:r>
+      <w:proofErr w:type="spellStart"/>
+      <w:r>
+        <w:t>fact_thi</w:t>
+      </w:r>
+      <w:proofErr w:type="spellEnd"/>
       <w:r>
         <w:t xml:space="preserve"> </w:t>
       </w:r>
-      <w:r>
-        <w:t>2 veergu, 86 rida. Ajaperiood 2005-2026.</w:t>
+      <w:proofErr w:type="spellStart"/>
+      <w:r>
+        <w:t>grain</w:t>
+      </w:r>
+      <w:proofErr w:type="spellEnd"/>
+      <w:r>
+        <w:t xml:space="preserve"> on Eesti keskmine THI indeks ühes kvartalis.</w:t>
+      </w:r>
+      <w:r>
+        <w:t xml:space="preserve"> 2 veergu, 86 rida. Ajaperiood 2005-2026.</w:t>
       </w:r>
     </w:p>
     <w:p>
@@ -1354,10 +1425,23 @@
         <w:t>ensiooni</w:t>
       </w:r>
       <w:r>
-        <w:t xml:space="preserve">tabeli dim_county </w:t>
-      </w:r>
-      <w:r>
-        <w:t>grain on üks unikaalne maakond.</w:t>
+        <w:t xml:space="preserve">tabeli </w:t>
+      </w:r>
+      <w:proofErr w:type="spellStart"/>
+      <w:r>
+        <w:t>dim_county</w:t>
+      </w:r>
+      <w:proofErr w:type="spellEnd"/>
+      <w:r>
+        <w:t xml:space="preserve"> </w:t>
+      </w:r>
+      <w:proofErr w:type="spellStart"/>
+      <w:r>
+        <w:t>grain</w:t>
+      </w:r>
+      <w:proofErr w:type="spellEnd"/>
+      <w:r>
+        <w:t xml:space="preserve"> on üks unikaalne maakond.</w:t>
       </w:r>
       <w:r>
         <w:t xml:space="preserve"> 2 veergu, 15 rida, 15 maakonda.</w:t>
@@ -1365,16 +1449,27 @@
     </w:p>
     <w:p>
       <w:r>
-        <w:t>Dimensioonitabeli dim_time grain on üks kvartal.</w:t>
-      </w:r>
-      <w:r>
-        <w:t xml:space="preserve"> 5 veergu, 86 rida. </w:t>
-      </w:r>
-      <w:r>
-        <w:t>Ajaperiood 2005-2026</w:t>
-      </w:r>
-      <w:r>
-        <w:t xml:space="preserve"> kõik kvartalid.</w:t>
+        <w:lastRenderedPageBreak/>
+        <w:t xml:space="preserve">Dimensioonitabeli </w:t>
+      </w:r>
+      <w:proofErr w:type="spellStart"/>
+      <w:r>
+        <w:t>dim_time</w:t>
+      </w:r>
+      <w:proofErr w:type="spellEnd"/>
+      <w:r>
+        <w:t xml:space="preserve"> </w:t>
+      </w:r>
+      <w:proofErr w:type="spellStart"/>
+      <w:r>
+        <w:t>grain</w:t>
+      </w:r>
+      <w:proofErr w:type="spellEnd"/>
+      <w:r>
+        <w:t xml:space="preserve"> on üks kvartal.</w:t>
+      </w:r>
+      <w:r>
+        <w:t xml:space="preserve"> 5 veergu, 86 rida. Ajaperiood 2005-2026 kõik kvartalid.</w:t>
       </w:r>
     </w:p>
     <w:p/>
@@ -2250,7 +2345,7 @@
           <w:noProof/>
         </w:rPr>
         <w:pict w14:anchorId="4C9DDDA8">
-          <v:rect id="_x0000_i1029" style="width:0;height:1.5pt" o:hralign="center" o:hrstd="t" o:hr="t" fillcolor="#a0a0a0" stroked="f"/>
+          <v:rect id="_x0000_i1030" style="width:0;height:1.5pt" o:hralign="center" o:hrstd="t" o:hr="t" fillcolor="#a0a0a0" stroked="f"/>
         </w:pict>
       </w:r>
     </w:p>
@@ -2978,6 +3073,7 @@
               <w:rPr>
                 <w:noProof/>
               </w:rPr>
+              <w:lastRenderedPageBreak/>
               <w:t>FK_county_id</w:t>
             </w:r>
           </w:p>
@@ -3139,7 +3235,6 @@
         <w:rPr>
           <w:noProof/>
         </w:rPr>
-        <w:lastRenderedPageBreak/>
         <w:t>3. Intressimäärade faktitabel (grupitoo_kv.Fact_intressid)</w:t>
       </w:r>
     </w:p>
@@ -3747,7 +3842,7 @@
           <w:noProof/>
         </w:rPr>
         <w:pict w14:anchorId="5F4D43CE">
-          <v:rect id="_x0000_i1034" style="width:0;height:1.5pt" o:hralign="center" o:bullet="t" o:hrstd="t" o:hr="t" fillcolor="#a0a0a0" stroked="f"/>
+          <v:rect id="_x0000_i1031" style="width:0;height:1.5pt" o:hralign="center" o:bullet="t" o:hrstd="t" o:hr="t" fillcolor="#a0a0a0" stroked="f"/>
         </w:pict>
       </w:r>
     </w:p>
@@ -3897,31 +3992,7 @@
         <w:rPr>
           <w:noProof/>
         </w:rPr>
-        <w:t>Kvartalite formaa</w:t>
-      </w:r>
-      <w:r>
-        <w:rPr>
-          <w:noProof/>
-        </w:rPr>
-        <w:t>tide ühtlustamine</w:t>
-      </w:r>
-      <w:r>
-        <w:rPr>
-          <w:noProof/>
-        </w:rPr>
-        <w:t xml:space="preserve"> Pythonis</w:t>
-      </w:r>
-      <w:r>
-        <w:rPr>
-          <w:noProof/>
-        </w:rPr>
-        <w:t>. Kvartalid</w:t>
-      </w:r>
-      <w:r>
-        <w:rPr>
-          <w:noProof/>
-        </w:rPr>
-        <w:t xml:space="preserve"> viidud ühtlasele kujule, kvartali tähisena kasutatud esimese kuupäeva formaati 2005-01-01, 2005-04-01 jne. </w:t>
+        <w:t xml:space="preserve">Kvartalite formaatide ühtlustamine Pythonis. Kvartalid viidud ühtlasele kujule, kvartali tähisena kasutatud esimese kuupäeva formaati 2005-01-01, 2005-04-01 jne. </w:t>
       </w:r>
     </w:p>
     <w:p>
@@ -3982,6 +4053,7 @@
         <w:rPr>
           <w:noProof/>
         </w:rPr>
+        <w:lastRenderedPageBreak/>
         <w:t>Kinnisvaraturu ostujõu indeksi arvutamine valemiga:</w:t>
       </w:r>
       <w:r>
@@ -4001,7 +4073,6 @@
         <w:rPr>
           <w:noProof/>
         </w:rPr>
-        <w:lastRenderedPageBreak/>
         <w:drawing>
           <wp:inline distT="0" distB="0" distL="0" distR="0" wp14:anchorId="322F2482" wp14:editId="77F13930">
             <wp:extent cx="12700" cy="12700"/>
@@ -4399,6 +4470,7 @@
           <w:bCs/>
           <w:noProof/>
         </w:rPr>
+        <w:lastRenderedPageBreak/>
         <w:t>Kasutajarakendus</w:t>
       </w:r>
       <w:r>
@@ -4448,7 +4520,6 @@
         <w:rPr>
           <w:noProof/>
         </w:rPr>
-        <w:lastRenderedPageBreak/>
         <w:t>Eraisikule ja koduostjale suunatud otsustustoe tööriista</w:t>
       </w:r>
       <w:r>
@@ -4574,7 +4645,7 @@
           <w:noProof/>
         </w:rPr>
         <w:pict w14:anchorId="55984D91">
-          <v:rect id="_x0000_i1031" style="width:0;height:1.5pt" o:hralign="center" o:hrstd="t" o:hr="t" fillcolor="#a0a0a0" stroked="f"/>
+          <v:rect id="_x0000_i1032" style="width:0;height:1.5pt" o:hralign="center" o:hrstd="t" o:hr="t" fillcolor="#a0a0a0" stroked="f"/>
         </w:pict>
       </w:r>
     </w:p>
@@ -4657,7 +4728,15 @@
         <w:annotationRef/>
       </w:r>
       <w:r>
-        <w:t>Analüüs ka Pythoni App</w:t>
+        <w:t xml:space="preserve">Analüüs ka </w:t>
+      </w:r>
+      <w:proofErr w:type="spellStart"/>
+      <w:r>
+        <w:t>Pythoni</w:t>
+      </w:r>
+      <w:proofErr w:type="spellEnd"/>
+      <w:r>
+        <w:t xml:space="preserve"> App</w:t>
       </w:r>
     </w:p>
   </w:comment>
@@ -4673,8 +4752,29 @@
         <w:annotationRef/>
       </w:r>
       <w:r>
-        <w:t>Peaks muutma SQL’is juba ka kõik eestikeelseks, et oleks läbivalt samas keeles ja siin update visuaalile</w:t>
-      </w:r>
+        <w:t xml:space="preserve">Peaks muutma </w:t>
+      </w:r>
+      <w:proofErr w:type="spellStart"/>
+      <w:r>
+        <w:t>SQL’is</w:t>
+      </w:r>
+      <w:proofErr w:type="spellEnd"/>
+      <w:r>
+        <w:t xml:space="preserve"> juba ka kõik eestikeelseks, et oleks läbivalt samas keeles ja siin </w:t>
+      </w:r>
+      <w:proofErr w:type="spellStart"/>
+      <w:r>
+        <w:t>update</w:t>
+      </w:r>
+      <w:proofErr w:type="spellEnd"/>
+      <w:r>
+        <w:t xml:space="preserve"> </w:t>
+      </w:r>
+      <w:proofErr w:type="spellStart"/>
+      <w:r>
+        <w:t>visuaalile</w:t>
+      </w:r>
+      <w:proofErr w:type="spellEnd"/>
     </w:p>
   </w:comment>
   <w:comment w:id="4" w:author="Õpilane" w:date="2026-10-01T14:13:00Z" w:initials="Õ">
@@ -4689,7 +4789,31 @@
         <w:annotationRef/>
       </w:r>
       <w:r>
-        <w:t>Minu meelest me PowerBI eelset Postgres vaadet ei pea eestikeelseks muutma? Küll aga peaksime PowerBI-s tabelite nimed korda tegema...</w:t>
+        <w:t xml:space="preserve">Minu meelest me </w:t>
+      </w:r>
+      <w:proofErr w:type="spellStart"/>
+      <w:r>
+        <w:t>PowerBI</w:t>
+      </w:r>
+      <w:proofErr w:type="spellEnd"/>
+      <w:r>
+        <w:t xml:space="preserve"> eelset </w:t>
+      </w:r>
+      <w:proofErr w:type="spellStart"/>
+      <w:r>
+        <w:t>Postgres</w:t>
+      </w:r>
+      <w:proofErr w:type="spellEnd"/>
+      <w:r>
+        <w:t xml:space="preserve"> vaadet ei pea eestikeelseks muutma? Küll aga peaksime </w:t>
+      </w:r>
+      <w:proofErr w:type="spellStart"/>
+      <w:r>
+        <w:t>PowerBI</w:t>
+      </w:r>
+      <w:proofErr w:type="spellEnd"/>
+      <w:r>
+        <w:t>-s tabelite nimed korda tegema...</w:t>
       </w:r>
     </w:p>
   </w:comment>
@@ -4768,7 +4892,7 @@
 <w:numbering xmlns:wpc="http://schemas.microsoft.com/office/word/2010/wordprocessingCanvas" xmlns:cx="http://schemas.microsoft.com/office/drawing/2014/chartex" xmlns:cx1="http://schemas.microsoft.com/office/drawing/2015/9/8/chartex" xmlns:cx2="http://schemas.microsoft.com/office/drawing/2015/10/21/chartex" xmlns:cx3="http://schemas.microsoft.com/office/drawing/2016/5/9/chartex" xmlns:cx4="http://schemas.microsoft.com/office/drawing/2016/5/10/chartex" xmlns:cx5="http://schemas.microsoft.com/office/drawing/2016/5/11/chartex" xmlns:cx6="http://schemas.microsoft.com/office/drawing/2016/5/12/chartex" xmlns:cx7="http://schemas.microsoft.com/office/drawing/2016/5/13/chartex" xmlns:cx8="http://schemas.microsoft.com/office/drawing/2016/5/14/chartex" xmlns:mc="http://schemas.openxmlformats.org/markup-compatibility/2006" xmlns:aink="http://schemas.microsoft.com/office/drawing/2016/ink" xmlns:am3d="http://schemas.microsoft.com/office/drawing/2017/model3d" xmlns:o="urn:schemas-microsoft-com:office:office" xmlns:oel="http://schemas.microsoft.com/office/2019/extlst" xmlns:r="http://schemas.openxmlformats.org/officeDocument/2006/relationships" xmlns:m="http://schemas.openxmlformats.org/officeDocument/2006/math" xmlns:v="urn:schemas-microsoft-com:vml" xmlns:wp14="http://schemas.microsoft.com/office/word/2010/wordprocessingDrawing" xmlns:wp="http://schemas.openxmlformats.org/drawingml/2006/wordprocessingDrawing" xmlns:w10="urn:schemas-microsoft-com:office:word" xmlns:w="http://schemas.openxmlformats.org/wordprocessingml/2006/main" xmlns:w14="http://schemas.microsoft.com/office/word/2010/wordml" xmlns:w15="http://schemas.microsoft.com/office/word/2012/wordml" xmlns:w16cex="http://schemas.microsoft.com/office/word/2018/wordml/cex" xmlns:w16cid="http://schemas.microsoft.com/office/word/2016/wordml/cid" xmlns:w16="http://schemas.microsoft.com/office/word/2018/wordml" xmlns:w16sdtdh="http://schemas.microsoft.com/office/word/2020/wordml/sdtdatahash" xmlns:w16se="http://schemas.microsoft.com/office/word/2015/wordml/symex" xmlns:wpg="http://schemas.microsoft.com/office/word/2010/wordprocessingGroup" xmlns:wpi="http://schemas.microsoft.com/office/word/2010/wordprocessingInk" xmlns:wne="http://schemas.microsoft.com/office/word/2006/wordml" xmlns:wps="http://schemas.microsoft.com/office/word/2010/wordprocessingShape" mc:Ignorable="w14 w15 w16se w16cid w16 w16cex w16sdtdh wp14">
   <w:numPicBullet w:numPicBulletId="0">
     <w:pict>
-      <v:rect id="_x0000_i1056" style="width:0;height:1.5pt" o:hralign="center" o:bullet="t" o:hrstd="t" o:hr="t" fillcolor="#a0a0a0" stroked="f"/>
+      <v:rect id="_x0000_i1032" style="width:0;height:1.5pt" o:hralign="center" o:bullet="t" o:hrstd="t" o:hr="t" fillcolor="#a0a0a0" stroked="f"/>
     </w:pict>
   </w:numPicBullet>
   <w:abstractNum w:abstractNumId="0" w15:restartNumberingAfterBreak="0">
@@ -14021,6 +14145,7 @@
   <w:style w:type="character" w:default="1" w:styleId="DefaultParagraphFont">
     <w:name w:val="Default Paragraph Font"/>
     <w:uiPriority w:val="1"/>
+    <w:semiHidden/>
     <w:unhideWhenUsed/>
   </w:style>
   <w:style w:type="table" w:default="1" w:styleId="TableNormal">

</xml_diff>

<commit_message>
Visuaalide kirjeldused ja muudatused
</commit_message>
<xml_diff>
--- a/Lõputöö kirjeldus.docx
+++ b/Lõputöö kirjeldus.docx
@@ -4717,12 +4717,12 @@
         <w:t>Analüüs ja visualiseerimine</w:t>
       </w:r>
     </w:p>
-    <w:p/>
     <w:p>
       <w:pPr>
         <w:rPr>
           <w:b/>
           <w:bCs/>
+          <w:noProof/>
         </w:rPr>
       </w:pPr>
       <w:r>
@@ -4730,29 +4730,37 @@
           <w:b/>
           <w:bCs/>
         </w:rPr>
-        <w:t>Graafik 1: Korterite m² hind ja brutopalk – Üldine trend</w:t>
+        <w:t xml:space="preserve">Graafik 1: </w:t>
+      </w:r>
+      <w:r>
+        <w:rPr>
+          <w:b/>
+          <w:bCs/>
+          <w:noProof/>
+        </w:rPr>
+        <w:t xml:space="preserve">Korterite keskmine m2 hind ja keskmine brutopalk aastate lõikes. </w:t>
       </w:r>
     </w:p>
     <w:p>
-      <w:r>
-        <w:t xml:space="preserve">Graafik </w:t>
-      </w:r>
-      <w:r>
-        <w:t>näitab</w:t>
-      </w:r>
-      <w:r>
-        <w:t xml:space="preserve">, et </w:t>
-      </w:r>
-      <w:r>
+      <w:pPr>
+        <w:rPr>
+          <w:noProof/>
+        </w:rPr>
+      </w:pPr>
+      <w:r>
+        <w:rPr>
+          <w:noProof/>
+        </w:rPr>
+        <w:t>Aruanne võimaldab visuaalselt jälgida läbi aastate, kuidas on muutunud keskmine brutopalk ja samal ajal korterite ruutmeetri hind ning kus muutuvad ’käärid’ kõige suuremaks. Valida saab kas kogu Eesti või maakonnad eraldi.</w:t>
+      </w:r>
+    </w:p>
+    <w:p>
+      <w:pPr>
         <w:rPr>
           <w:b/>
           <w:bCs/>
         </w:rPr>
-        <w:t>"Kinnisvara ostujõu indeks"</w:t>
-      </w:r>
-      <w:r>
-        <w:t xml:space="preserve"> (m² ühe kuupalga eest) paranes oluliselt 2010. aasta kriisipõhjas (kus palk oli ~650 € ja m² hind vaid ~350 €), liikus stabiilses tasakaalus eelmisel kümnendil ning on tänaseks (2025–2026) uue nominaalpalga kiire tõusu tõttu (~1800 €) kriisieelsest (2007) mullist tervislikumas seisus.</w:t>
-      </w:r>
+      </w:pPr>
     </w:p>
     <w:p>
       <w:pPr>
@@ -4825,62 +4833,109 @@
           <w:bCs/>
           <w:noProof/>
         </w:rPr>
-        <w:t>Graafik 2: Kinnisvarahindade ja palga seos – Regionaalne lõhe</w:t>
+        <w:t xml:space="preserve">Graafik 2: </w:t>
+      </w:r>
+      <w:r>
+        <w:rPr>
+          <w:b/>
+          <w:bCs/>
+          <w:noProof/>
+        </w:rPr>
+        <w:t>R script, et võrrelda korteri ruutmeetri hinna ja keskmise brutopalga trajektoori</w:t>
+      </w:r>
+      <w:r>
+        <w:rPr>
+          <w:b/>
+          <w:bCs/>
+          <w:noProof/>
+        </w:rPr>
+        <w:t xml:space="preserve"> maakondade lõikes</w:t>
+      </w:r>
+      <w:r>
+        <w:rPr>
+          <w:b/>
+          <w:bCs/>
+          <w:noProof/>
+        </w:rPr>
+        <w:t>.</w:t>
+      </w:r>
+      <w:r>
+        <w:rPr>
+          <w:noProof/>
+        </w:rPr>
+        <w:t xml:space="preserve"> </w:t>
       </w:r>
     </w:p>
     <w:p>
       <w:pPr>
-        <w:numPr>
-          <w:ilvl w:val="0"/>
-          <w:numId w:val="64"/>
-        </w:numPr>
-        <w:rPr>
-          <w:noProof/>
-        </w:rPr>
-      </w:pPr>
-      <w:r>
-        <w:rPr>
-          <w:b/>
-          <w:bCs/>
-          <w:noProof/>
-        </w:rPr>
-        <w:t>Harju ja Tartu maakond</w:t>
-      </w:r>
-      <w:r>
-        <w:rPr>
-          <w:noProof/>
-        </w:rPr>
-        <w:t xml:space="preserve"> esindavad kõrge turuaktiivsusega piirkondi, kus seos palga ja m² hinna vahel on ülitugev ja lineaarne. Siin on oht, et kinnisvara "põgeneb" tavainimese eest, kõige suurem.</w:t>
+        <w:rPr>
+          <w:noProof/>
+        </w:rPr>
+      </w:pPr>
+      <w:r>
+        <w:rPr>
+          <w:noProof/>
+        </w:rPr>
+        <w:t>Kõrvalekalded trajektoorist näitavad piltlikult, kus kinnisvara hind kallines kiiremini ja rohkem võrreldes palgaga ning kus oli palgatõus suurema mõjuga ning kinnisvara hind ei kallinenud nii palju. Graafik võimaldab t</w:t>
+      </w:r>
+      <w:r>
+        <w:rPr>
+          <w:noProof/>
+        </w:rPr>
+        <w:t>uvasta</w:t>
+      </w:r>
+      <w:r>
+        <w:rPr>
+          <w:noProof/>
+        </w:rPr>
+        <w:t>da</w:t>
+      </w:r>
+      <w:r>
+        <w:rPr>
+          <w:noProof/>
+        </w:rPr>
+        <w:t xml:space="preserve">, millises maakonnas </w:t>
+      </w:r>
+      <w:r>
+        <w:rPr>
+          <w:noProof/>
+        </w:rPr>
+        <w:t>läbi aastate on</w:t>
+      </w:r>
+      <w:r>
+        <w:rPr>
+          <w:noProof/>
+        </w:rPr>
+        <w:t xml:space="preserve"> ostujõud</w:t>
+      </w:r>
+      <w:r>
+        <w:rPr>
+          <w:noProof/>
+        </w:rPr>
+        <w:t xml:space="preserve"> võrreldes korterite hindadega madalam ning kus on ostujõud suurem</w:t>
+      </w:r>
+      <w:r>
+        <w:rPr>
+          <w:noProof/>
+        </w:rPr>
+        <w:t>.</w:t>
       </w:r>
     </w:p>
     <w:p>
       <w:pPr>
-        <w:numPr>
-          <w:ilvl w:val="0"/>
-          <w:numId w:val="64"/>
-        </w:numPr>
-        <w:rPr>
-          <w:noProof/>
-        </w:rPr>
-      </w:pPr>
-      <w:r>
-        <w:rPr>
-          <w:b/>
-          <w:bCs/>
-          <w:noProof/>
-        </w:rPr>
-        <w:t>Ida-Viru ja Lääne-Viru</w:t>
-      </w:r>
-      <w:r>
-        <w:rPr>
-          <w:noProof/>
-        </w:rPr>
-        <w:t xml:space="preserve"> maakonnad näitavad madalat tõusu (lame trendijoon), mis viitab sellele, et nendes regioonides ei ole palkade kasv hinnanäitajaid üles rühkinud ja kinnisvara on kättesaadav, kuid turg on ebaaktiivne (väikesed mullid).</w:t>
+        <w:rPr>
+          <w:noProof/>
+        </w:rPr>
+      </w:pPr>
+      <w:r>
+        <w:rPr>
+          <w:noProof/>
+        </w:rPr>
+        <w:t>Samal ajal kajastab mummukeste suurus graafikul tehinguaktiivsust ehk tehingute arvu antud maakonnas antud aastal. Mida suurem tehingute arv, seda suurem on mummuke graafikul, mis ilmestab maakondade erinevusi. Vaikimisi näidatatksegi 5 suurima tehinguaktiivsusega maakonda.</w:t>
       </w:r>
     </w:p>
     <w:p>
       <w:pPr>
-        <w:ind w:left="720"/>
         <w:rPr>
           <w:noProof/>
         </w:rPr>
@@ -4954,7 +5009,7 @@
           <w:bCs/>
           <w:noProof/>
         </w:rPr>
-        <w:t>Graafik 3: Kinnisvara hindade ja intressimäärade suhe – Finantstingimused</w:t>
+        <w:t>Graafik 3: Kinnisvara hindade ja intressimäärade suhe</w:t>
       </w:r>
     </w:p>
     <w:p>
@@ -4967,19 +5022,20 @@
         <w:rPr>
           <w:noProof/>
         </w:rPr>
-        <w:t xml:space="preserve">See demonstreerib ilmekalt, kuidas keskpanga rahapoliitika (Eesti Panga eluasemelaenude intressimäär) reguleerib turgu. Madala intressiga keskkond (2015–2021 stabiilne 2,2%–2,5%) toimis turu </w:t>
-      </w:r>
-      <w:r>
-        <w:rPr>
-          <w:noProof/>
-        </w:rPr>
-        <w:t>kütusena</w:t>
-      </w:r>
-      <w:r>
-        <w:rPr>
-          <w:noProof/>
-        </w:rPr>
-        <w:t>, lubades m² hinnal kasvada ilma, et kuumakse oleks elanikule üle jõu käinud.</w:t>
+        <w:lastRenderedPageBreak/>
+        <w:t xml:space="preserve">Graafik näitab </w:t>
+      </w:r>
+      <w:r>
+        <w:rPr>
+          <w:noProof/>
+        </w:rPr>
+        <w:t>Eesti Panga eluasemelaenude intressimäär</w:t>
+      </w:r>
+      <w:r>
+        <w:rPr>
+          <w:noProof/>
+        </w:rPr>
+        <w:t xml:space="preserve">a ja korterite keskmise ruutmeetri hinna muutumist läbi aastate. </w:t>
       </w:r>
     </w:p>
     <w:p>
@@ -4992,7 +5048,6 @@
         <w:rPr>
           <w:noProof/>
         </w:rPr>
-        <w:lastRenderedPageBreak/>
         <w:drawing>
           <wp:inline distT="0" distB="0" distL="0" distR="0" wp14:anchorId="7494CF3A" wp14:editId="2A34E1C3">
             <wp:extent cx="5731510" cy="1865630"/>
@@ -5043,36 +5098,35 @@
           <w:b/>
           <w:bCs/>
         </w:rPr>
-        <w:t>Graafik 4: Kumulatiivne kasv – Pikaajaline ostujõud (Baas 2005)</w:t>
+        <w:t xml:space="preserve">Graafik 4: </w:t>
+      </w:r>
+      <w:r>
+        <w:rPr>
+          <w:b/>
+          <w:bCs/>
+        </w:rPr>
+        <w:t>Korteri keskmise ruutmeetri hinna, brutopalga ja THI indeksite võrdlus ajas (b</w:t>
+      </w:r>
+      <w:r>
+        <w:rPr>
+          <w:b/>
+          <w:bCs/>
+        </w:rPr>
+        <w:t>aas 2005)</w:t>
       </w:r>
     </w:p>
     <w:p>
       <w:r>
-        <w:rPr>
-          <w:b/>
-          <w:bCs/>
-        </w:rPr>
-        <w:t>P</w:t>
-      </w:r>
-      <w:r>
-        <w:rPr>
-          <w:b/>
-          <w:bCs/>
-        </w:rPr>
-        <w:t>ikas plaanis ei ole elamispind muutunud kättesaamatuks luksuseks</w:t>
-      </w:r>
-      <w:r>
-        <w:t>, vaid viimase viie aasta kriisid (THI ja Euribori järsk tõus) lõid lühiajalise hälbe, millest turg on palkade järelejõudmise tõttu praegu (2026) väljumas.</w:t>
+        <w:t xml:space="preserve">Kolme näitaja võrdlemiseks on kõik viidud indeksi kujule, kasutades baasina aastat 2005. Indeksite võrdlus võimaldab piltlikult näidata, milline kolmest parameetrist on enim kasvanud. </w:t>
       </w:r>
     </w:p>
-    <w:p/>
     <w:p>
       <w:r>
         <w:drawing>
-          <wp:inline distT="0" distB="0" distL="0" distR="0" wp14:anchorId="0C2A0C86" wp14:editId="74B3DC2D">
-            <wp:extent cx="5731510" cy="1882775"/>
-            <wp:effectExtent l="0" t="0" r="2540" b="3175"/>
-            <wp:docPr id="7" name="Picture 7"/>
+          <wp:inline distT="0" distB="0" distL="0" distR="0" wp14:anchorId="2A2EAC2A" wp14:editId="1BA65F58">
+            <wp:extent cx="5731510" cy="1902460"/>
+            <wp:effectExtent l="0" t="0" r="2540" b="2540"/>
+            <wp:docPr id="3" name="Picture 3"/>
             <wp:cNvGraphicFramePr>
               <a:graphicFrameLocks xmlns:a="http://schemas.openxmlformats.org/drawingml/2006/main" noChangeAspect="1"/>
             </wp:cNvGraphicFramePr>
@@ -5092,7 +5146,7 @@
                   <pic:spPr>
                     <a:xfrm>
                       <a:off x="0" y="0"/>
-                      <a:ext cx="5731510" cy="1882775"/>
+                      <a:ext cx="5731510" cy="1902460"/>
                     </a:xfrm>
                     <a:prstGeom prst="rect">
                       <a:avLst/>
@@ -5409,7 +5463,7 @@
 <w:numbering xmlns:wpc="http://schemas.microsoft.com/office/word/2010/wordprocessingCanvas" xmlns:cx="http://schemas.microsoft.com/office/drawing/2014/chartex" xmlns:cx1="http://schemas.microsoft.com/office/drawing/2015/9/8/chartex" xmlns:cx2="http://schemas.microsoft.com/office/drawing/2015/10/21/chartex" xmlns:cx3="http://schemas.microsoft.com/office/drawing/2016/5/9/chartex" xmlns:cx4="http://schemas.microsoft.com/office/drawing/2016/5/10/chartex" xmlns:cx5="http://schemas.microsoft.com/office/drawing/2016/5/11/chartex" xmlns:cx6="http://schemas.microsoft.com/office/drawing/2016/5/12/chartex" xmlns:cx7="http://schemas.microsoft.com/office/drawing/2016/5/13/chartex" xmlns:cx8="http://schemas.microsoft.com/office/drawing/2016/5/14/chartex" xmlns:mc="http://schemas.openxmlformats.org/markup-compatibility/2006" xmlns:aink="http://schemas.microsoft.com/office/drawing/2016/ink" xmlns:am3d="http://schemas.microsoft.com/office/drawing/2017/model3d" xmlns:o="urn:schemas-microsoft-com:office:office" xmlns:oel="http://schemas.microsoft.com/office/2019/extlst" xmlns:r="http://schemas.openxmlformats.org/officeDocument/2006/relationships" xmlns:m="http://schemas.openxmlformats.org/officeDocument/2006/math" xmlns:v="urn:schemas-microsoft-com:vml" xmlns:wp14="http://schemas.microsoft.com/office/word/2010/wordprocessingDrawing" xmlns:wp="http://schemas.openxmlformats.org/drawingml/2006/wordprocessingDrawing" xmlns:w10="urn:schemas-microsoft-com:office:word" xmlns:w="http://schemas.openxmlformats.org/wordprocessingml/2006/main" xmlns:w14="http://schemas.microsoft.com/office/word/2010/wordml" xmlns:w15="http://schemas.microsoft.com/office/word/2012/wordml" xmlns:w16cex="http://schemas.microsoft.com/office/word/2018/wordml/cex" xmlns:w16cid="http://schemas.microsoft.com/office/word/2016/wordml/cid" xmlns:w16="http://schemas.microsoft.com/office/word/2018/wordml" xmlns:w16sdtdh="http://schemas.microsoft.com/office/word/2020/wordml/sdtdatahash" xmlns:w16se="http://schemas.microsoft.com/office/word/2015/wordml/symex" xmlns:wpg="http://schemas.microsoft.com/office/word/2010/wordprocessingGroup" xmlns:wpi="http://schemas.microsoft.com/office/word/2010/wordprocessingInk" xmlns:wne="http://schemas.microsoft.com/office/word/2006/wordml" xmlns:wps="http://schemas.microsoft.com/office/word/2010/wordprocessingShape" mc:Ignorable="w14 w15 w16se w16cid w16 w16cex w16sdtdh wp14">
   <w:numPicBullet w:numPicBulletId="0">
     <w:pict>
-      <v:rect id="_x0000_i1049" style="width:0;height:1.5pt" o:hralign="center" o:bullet="t" o:hrstd="t" o:hr="t" fillcolor="#a0a0a0" stroked="f"/>
+      <v:rect id="_x0000_i1081" style="width:0;height:1.5pt" o:hralign="center" o:bullet="t" o:hrstd="t" o:hr="t" fillcolor="#a0a0a0" stroked="f"/>
     </w:pict>
   </w:numPicBullet>
   <w:abstractNum w:abstractNumId="0" w15:restartNumberingAfterBreak="0">
@@ -15266,6 +15320,7 @@
   <w:style w:type="character" w:default="1" w:styleId="DefaultParagraphFont">
     <w:name w:val="Default Paragraph Font"/>
     <w:uiPriority w:val="1"/>
+    <w:semiHidden/>
     <w:unhideWhenUsed/>
   </w:style>
   <w:style w:type="table" w:default="1" w:styleId="TableNormal">

</xml_diff>